<commit_message>
fix(deps): lock matplotlib in pyproject and uv lock for cli startup
- Add matplotlib>=3.8.0 to pyproject.toml dependencies
- Synchronize uv.lock with rendering sub-dependencies
- Bump version to v1.14.1 across manifest and package init
- Document v1.14.1 patch release in CHANGELOG.md
</commit_message>
<xml_diff>
--- a/templates/QUICK REPORT/DEFECT IR US TEV/swg-panel.docx
+++ b/templates/QUICK REPORT/DEFECT IR US TEV/swg-panel.docx
@@ -161,21 +161,7 @@
               <w:rPr>
                 <w:rFonts w:ascii="Calibri" w:eastAsia="Calibri" w:hAnsi="Calibri" w:cs="Calibri"/>
               </w:rPr>
-              <w:t xml:space="preserve">{{ </w:t>
-            </w:r>
-            <w:proofErr w:type="spellStart"/>
-            <w:r>
-              <w:rPr>
-                <w:rFonts w:ascii="Calibri" w:eastAsia="Calibri" w:hAnsi="Calibri" w:cs="Calibri"/>
-              </w:rPr>
-              <w:t>substation.name_erms</w:t>
-            </w:r>
-            <w:proofErr w:type="spellEnd"/>
-            <w:r>
-              <w:rPr>
-                <w:rFonts w:ascii="Calibri" w:eastAsia="Calibri" w:hAnsi="Calibri" w:cs="Calibri"/>
-              </w:rPr>
-              <w:t xml:space="preserve"> }}</w:t>
+              <w:t>{{ substation.name_erms }}</w:t>
             </w:r>
           </w:p>
         </w:tc>
@@ -197,21 +183,7 @@
               <w:rPr>
                 <w:rFonts w:ascii="Calibri" w:eastAsia="Calibri" w:hAnsi="Calibri" w:cs="Calibri"/>
               </w:rPr>
-              <w:t xml:space="preserve">Date: {{ </w:t>
-            </w:r>
-            <w:proofErr w:type="spellStart"/>
-            <w:r>
-              <w:rPr>
-                <w:rFonts w:ascii="Calibri" w:eastAsia="Calibri" w:hAnsi="Calibri" w:cs="Calibri"/>
-              </w:rPr>
-              <w:t>substation.date</w:t>
-            </w:r>
-            <w:proofErr w:type="spellEnd"/>
-            <w:r>
-              <w:rPr>
-                <w:rFonts w:ascii="Calibri" w:eastAsia="Calibri" w:hAnsi="Calibri" w:cs="Calibri"/>
-              </w:rPr>
-              <w:t xml:space="preserve"> }}</w:t>
+              <w:t>Date: {{ substation.date }}</w:t>
             </w:r>
           </w:p>
         </w:tc>
@@ -277,21 +249,7 @@
               <w:rPr>
                 <w:rFonts w:ascii="Calibri" w:eastAsia="Calibri" w:hAnsi="Calibri" w:cs="Calibri"/>
               </w:rPr>
-              <w:t xml:space="preserve">{{ </w:t>
-            </w:r>
-            <w:proofErr w:type="spellStart"/>
-            <w:r>
-              <w:rPr>
-                <w:rFonts w:ascii="Calibri" w:eastAsia="Calibri" w:hAnsi="Calibri" w:cs="Calibri"/>
-              </w:rPr>
-              <w:t>swg.type</w:t>
-            </w:r>
-            <w:proofErr w:type="spellEnd"/>
-            <w:r>
-              <w:rPr>
-                <w:rFonts w:ascii="Calibri" w:eastAsia="Calibri" w:hAnsi="Calibri" w:cs="Calibri"/>
-              </w:rPr>
-              <w:t xml:space="preserve"> }}</w:t>
+              <w:t>{{ swg.type }}</w:t>
             </w:r>
           </w:p>
         </w:tc>
@@ -357,21 +315,7 @@
               <w:rPr>
                 <w:rFonts w:ascii="Calibri" w:eastAsia="Calibri" w:hAnsi="Calibri" w:cs="Calibri"/>
               </w:rPr>
-              <w:t xml:space="preserve">{{ </w:t>
-            </w:r>
-            <w:proofErr w:type="spellStart"/>
-            <w:r>
-              <w:rPr>
-                <w:rFonts w:ascii="Calibri" w:eastAsia="Calibri" w:hAnsi="Calibri" w:cs="Calibri"/>
-              </w:rPr>
-              <w:t>swg.type</w:t>
-            </w:r>
-            <w:proofErr w:type="spellEnd"/>
-            <w:r>
-              <w:rPr>
-                <w:rFonts w:ascii="Calibri" w:eastAsia="Calibri" w:hAnsi="Calibri" w:cs="Calibri"/>
-              </w:rPr>
-              <w:t xml:space="preserve"> }}</w:t>
+              <w:t>{{ swg.type }}</w:t>
             </w:r>
           </w:p>
         </w:tc>
@@ -435,21 +379,7 @@
               <w:rPr>
                 <w:rFonts w:ascii="Calibri" w:eastAsia="Calibri" w:hAnsi="Calibri" w:cs="Calibri"/>
               </w:rPr>
-              <w:t xml:space="preserve">{{ </w:t>
-            </w:r>
-            <w:proofErr w:type="spellStart"/>
-            <w:r>
-              <w:rPr>
-                <w:rFonts w:ascii="Calibri" w:eastAsia="Calibri" w:hAnsi="Calibri" w:cs="Calibri"/>
-              </w:rPr>
-              <w:t>swg.model</w:t>
-            </w:r>
-            <w:proofErr w:type="spellEnd"/>
-            <w:r>
-              <w:rPr>
-                <w:rFonts w:ascii="Calibri" w:eastAsia="Calibri" w:hAnsi="Calibri" w:cs="Calibri"/>
-              </w:rPr>
-              <w:t xml:space="preserve"> }}</w:t>
+              <w:t>{{ swg.model }}</w:t>
             </w:r>
           </w:p>
         </w:tc>
@@ -515,21 +445,7 @@
               <w:rPr>
                 <w:rFonts w:ascii="Calibri" w:eastAsia="Calibri" w:hAnsi="Calibri" w:cs="Calibri"/>
               </w:rPr>
-              <w:t xml:space="preserve">{{ </w:t>
-            </w:r>
-            <w:proofErr w:type="spellStart"/>
-            <w:r>
-              <w:rPr>
-                <w:rFonts w:ascii="Calibri" w:eastAsia="Calibri" w:hAnsi="Calibri" w:cs="Calibri"/>
-              </w:rPr>
-              <w:t>swg.model</w:t>
-            </w:r>
-            <w:proofErr w:type="spellEnd"/>
-            <w:r>
-              <w:rPr>
-                <w:rFonts w:ascii="Calibri" w:eastAsia="Calibri" w:hAnsi="Calibri" w:cs="Calibri"/>
-              </w:rPr>
-              <w:t xml:space="preserve"> }}</w:t>
+              <w:t>{{ swg.model }}</w:t>
             </w:r>
           </w:p>
         </w:tc>
@@ -593,21 +509,7 @@
               <w:rPr>
                 <w:rFonts w:ascii="Calibri" w:eastAsia="Calibri" w:hAnsi="Calibri" w:cs="Calibri"/>
               </w:rPr>
-              <w:t xml:space="preserve">{{ </w:t>
-            </w:r>
-            <w:proofErr w:type="spellStart"/>
-            <w:r>
-              <w:rPr>
-                <w:rFonts w:ascii="Calibri" w:eastAsia="Calibri" w:hAnsi="Calibri" w:cs="Calibri"/>
-              </w:rPr>
-              <w:t>panel.area</w:t>
-            </w:r>
-            <w:proofErr w:type="spellEnd"/>
-            <w:r>
-              <w:rPr>
-                <w:rFonts w:ascii="Calibri" w:eastAsia="Calibri" w:hAnsi="Calibri" w:cs="Calibri"/>
-              </w:rPr>
-              <w:t xml:space="preserve"> }}</w:t>
+              <w:t>{{ panel.area }}</w:t>
             </w:r>
           </w:p>
         </w:tc>
@@ -649,9 +551,9 @@
             </w:pPr>
             <w:r>
               <w:rPr>
-                <w:rFonts w:ascii="Calibri" w:eastAsia="Calibri" w:hAnsi="Calibri" w:cs="Calibri"/>
-              </w:rPr>
-              <w:t>Area</w:t>
+                <w:rFonts w:cstheme="minorHAnsi"/>
+              </w:rPr>
+              <w:t>{{ panel.linknumber }}</w:t>
             </w:r>
           </w:p>
         </w:tc>
@@ -1080,7 +982,7 @@
                   <v:path o:extrusionok="f" gradientshapeok="t" o:connecttype="rect"/>
                   <o:lock v:ext="edit" aspectratio="t"/>
                 </v:shapetype>
-                <v:shape id="_x0000_i1027" type="#_x0000_t75" style="width:237.7pt;height:147.85pt" o:ole="">
+                <v:shape id="_x0000_i1027" type="#_x0000_t75" style="width:237.85pt;height:147.85pt" o:ole="">
                   <v:imagedata r:id="rId7" o:title="" croptop="1206f" cropbottom="3617f" cropleft="781f" cropright="781f"/>
                 </v:shape>
                 <w:control r:id="rId8" w:name="CIRViewer1211111131211" w:shapeid="_x0000_i1027"/>
@@ -1222,21 +1124,7 @@
               <w:rPr>
                 <w:rFonts w:ascii="Calibri" w:eastAsia="Calibri" w:hAnsi="Calibri" w:cs="Calibri"/>
               </w:rPr>
-              <w:t xml:space="preserve">{{ </w:t>
-            </w:r>
-            <w:proofErr w:type="spellStart"/>
-            <w:r>
-              <w:rPr>
-                <w:rFonts w:ascii="Calibri" w:eastAsia="Calibri" w:hAnsi="Calibri" w:cs="Calibri"/>
-              </w:rPr>
-              <w:t>visual.image</w:t>
-            </w:r>
-            <w:proofErr w:type="spellEnd"/>
-            <w:r>
-              <w:rPr>
-                <w:rFonts w:ascii="Calibri" w:eastAsia="Calibri" w:hAnsi="Calibri" w:cs="Calibri"/>
-              </w:rPr>
-              <w:t xml:space="preserve"> }}</w:t>
+              <w:t>{{ visual.image }}</w:t>
             </w:r>
           </w:p>
         </w:tc>
@@ -1563,7 +1451,7 @@
                 <w:sz w:val="20"/>
                 <w:szCs w:val="18"/>
               </w:rPr>
-              <w:instrText xml:space="preserve">DOCVARIABLE _Fd2022395087 \* MERGEFORMAT </w:instrText>
+              <w:instrText xml:space="preserve">DOCVARIABLE _Fd663856097 \* MERGEFORMAT </w:instrText>
             </w:r>
             <w:r>
               <w:rPr>
@@ -1756,7 +1644,7 @@
                 <w:sz w:val="20"/>
                 <w:szCs w:val="18"/>
               </w:rPr>
-              <w:instrText xml:space="preserve">DOCVARIABLE _Fd880622982 \* MERGEFORMAT </w:instrText>
+              <w:instrText xml:space="preserve">DOCVARIABLE _Fd1359591791 \* MERGEFORMAT </w:instrText>
             </w:r>
             <w:r>
               <w:rPr>
@@ -1853,25 +1741,7 @@
                 <w:sz w:val="20"/>
                 <w:szCs w:val="18"/>
               </w:rPr>
-              <w:t xml:space="preserve">{{ </w:t>
-            </w:r>
-            <w:proofErr w:type="spellStart"/>
-            <w:r>
-              <w:rPr>
-                <w:rFonts w:ascii="Calibri" w:eastAsia="Calibri" w:hAnsi="Calibri" w:cs="Calibri"/>
-                <w:sz w:val="20"/>
-                <w:szCs w:val="18"/>
-              </w:rPr>
-              <w:t>panel.serialnumber</w:t>
-            </w:r>
-            <w:proofErr w:type="spellEnd"/>
-            <w:r>
-              <w:rPr>
-                <w:rFonts w:ascii="Calibri" w:eastAsia="Calibri" w:hAnsi="Calibri" w:cs="Calibri"/>
-                <w:sz w:val="20"/>
-                <w:szCs w:val="18"/>
-              </w:rPr>
-              <w:t xml:space="preserve"> }}</w:t>
+              <w:t>{{ panel.serialnumber }}</w:t>
             </w:r>
           </w:p>
         </w:tc>
@@ -1971,7 +1841,7 @@
                 <w:sz w:val="20"/>
                 <w:szCs w:val="18"/>
               </w:rPr>
-              <w:instrText xml:space="preserve">DOCVARIABLE _Fd2096506723 \* MERGEFORMAT </w:instrText>
+              <w:instrText xml:space="preserve">DOCVARIABLE _Fd1903727906 \* MERGEFORMAT </w:instrText>
             </w:r>
             <w:r>
               <w:rPr>
@@ -2075,25 +1945,7 @@
                 <w:sz w:val="20"/>
                 <w:szCs w:val="18"/>
               </w:rPr>
-              <w:t xml:space="preserve">{{ </w:t>
-            </w:r>
-            <w:proofErr w:type="spellStart"/>
-            <w:r>
-              <w:rPr>
-                <w:rFonts w:ascii="Calibri" w:eastAsia="Calibri" w:hAnsi="Calibri" w:cs="Calibri"/>
-                <w:sz w:val="20"/>
-                <w:szCs w:val="18"/>
-              </w:rPr>
-              <w:t>panel.heateramp</w:t>
-            </w:r>
-            <w:proofErr w:type="spellEnd"/>
-            <w:r>
-              <w:rPr>
-                <w:rFonts w:ascii="Calibri" w:eastAsia="Calibri" w:hAnsi="Calibri" w:cs="Calibri"/>
-                <w:sz w:val="20"/>
-                <w:szCs w:val="18"/>
-              </w:rPr>
-              <w:t xml:space="preserve"> }}</w:t>
+              <w:t>{{ panel.heateramp }}</w:t>
             </w:r>
           </w:p>
         </w:tc>
@@ -2185,25 +2037,7 @@
                 <w:sz w:val="20"/>
                 <w:szCs w:val="20"/>
               </w:rPr>
-              <w:t xml:space="preserve">{{ </w:t>
-            </w:r>
-            <w:proofErr w:type="spellStart"/>
-            <w:r>
-              <w:rPr>
-                <w:rFonts w:ascii="Calibri" w:eastAsia="Calibri" w:hAnsi="Calibri" w:cs="Calibri"/>
-                <w:sz w:val="20"/>
-                <w:szCs w:val="20"/>
-              </w:rPr>
-              <w:t>substation.ambient</w:t>
-            </w:r>
-            <w:proofErr w:type="spellEnd"/>
-            <w:r>
-              <w:rPr>
-                <w:rFonts w:ascii="Calibri" w:eastAsia="Calibri" w:hAnsi="Calibri" w:cs="Calibri"/>
-                <w:sz w:val="20"/>
-                <w:szCs w:val="20"/>
-              </w:rPr>
-              <w:t xml:space="preserve"> }}</w:t>
+              <w:t>{{ substation.ambient }}</w:t>
             </w:r>
           </w:p>
         </w:tc>
@@ -2276,25 +2110,7 @@
                 <w:sz w:val="20"/>
                 <w:szCs w:val="18"/>
               </w:rPr>
-              <w:t xml:space="preserve">{{ </w:t>
-            </w:r>
-            <w:proofErr w:type="spellStart"/>
-            <w:r>
-              <w:rPr>
-                <w:rFonts w:ascii="Calibri" w:eastAsia="Calibri" w:hAnsi="Calibri" w:cs="Calibri"/>
-                <w:sz w:val="20"/>
-                <w:szCs w:val="18"/>
-              </w:rPr>
-              <w:t>panel.breakerstatus</w:t>
-            </w:r>
-            <w:proofErr w:type="spellEnd"/>
-            <w:r>
-              <w:rPr>
-                <w:rFonts w:ascii="Calibri" w:eastAsia="Calibri" w:hAnsi="Calibri" w:cs="Calibri"/>
-                <w:sz w:val="20"/>
-                <w:szCs w:val="18"/>
-              </w:rPr>
-              <w:t xml:space="preserve"> }}</w:t>
+              <w:t>{{ panel.breakerstatus }}</w:t>
             </w:r>
           </w:p>
         </w:tc>
@@ -2395,7 +2211,7 @@
                 <w:sz w:val="20"/>
                 <w:szCs w:val="20"/>
               </w:rPr>
-              <w:instrText xml:space="preserve">DOCVARIABLE _Fd845965887 \* MERGEFORMAT </w:instrText>
+              <w:instrText xml:space="preserve">DOCVARIABLE _Fd908560405 \* MERGEFORMAT </w:instrText>
             </w:r>
             <w:r>
               <w:rPr>
@@ -2498,25 +2314,7 @@
                 <w:sz w:val="20"/>
                 <w:szCs w:val="18"/>
               </w:rPr>
-              <w:t xml:space="preserve">{{ </w:t>
-            </w:r>
-            <w:proofErr w:type="spellStart"/>
-            <w:r>
-              <w:rPr>
-                <w:rFonts w:ascii="Calibri" w:eastAsia="Calibri" w:hAnsi="Calibri" w:cs="Calibri"/>
-                <w:sz w:val="20"/>
-                <w:szCs w:val="18"/>
-              </w:rPr>
-              <w:t>panel.busbarposition</w:t>
-            </w:r>
-            <w:proofErr w:type="spellEnd"/>
-            <w:r>
-              <w:rPr>
-                <w:rFonts w:ascii="Calibri" w:eastAsia="Calibri" w:hAnsi="Calibri" w:cs="Calibri"/>
-                <w:sz w:val="20"/>
-                <w:szCs w:val="18"/>
-              </w:rPr>
-              <w:t xml:space="preserve"> }}</w:t>
+              <w:t>{{ panel.busbarposition }}</w:t>
             </w:r>
           </w:p>
         </w:tc>
@@ -2608,25 +2406,7 @@
                 <w:sz w:val="20"/>
                 <w:szCs w:val="18"/>
               </w:rPr>
-              <w:t xml:space="preserve">{{ </w:t>
-            </w:r>
-            <w:proofErr w:type="spellStart"/>
-            <w:r>
-              <w:rPr>
-                <w:rFonts w:ascii="Calibri" w:eastAsia="Calibri" w:hAnsi="Calibri" w:cs="Calibri"/>
-                <w:sz w:val="20"/>
-                <w:szCs w:val="18"/>
-              </w:rPr>
-              <w:t>panel.loadamp</w:t>
-            </w:r>
-            <w:proofErr w:type="spellEnd"/>
-            <w:r>
-              <w:rPr>
-                <w:rFonts w:ascii="Calibri" w:eastAsia="Calibri" w:hAnsi="Calibri" w:cs="Calibri"/>
-                <w:sz w:val="20"/>
-                <w:szCs w:val="18"/>
-              </w:rPr>
-              <w:t xml:space="preserve"> }}</w:t>
+              <w:t>{{ panel.loadamp }}</w:t>
             </w:r>
           </w:p>
         </w:tc>
@@ -2705,25 +2485,7 @@
                 <w:sz w:val="20"/>
                 <w:szCs w:val="18"/>
               </w:rPr>
-              <w:t xml:space="preserve">{{ </w:t>
-            </w:r>
-            <w:proofErr w:type="spellStart"/>
-            <w:r>
-              <w:rPr>
-                <w:rFonts w:ascii="Calibri" w:eastAsia="Calibri" w:hAnsi="Calibri" w:cs="Calibri"/>
-                <w:sz w:val="20"/>
-                <w:szCs w:val="18"/>
-              </w:rPr>
-              <w:t>panel.cabletype</w:t>
-            </w:r>
-            <w:proofErr w:type="spellEnd"/>
-            <w:r>
-              <w:rPr>
-                <w:rFonts w:ascii="Calibri" w:eastAsia="Calibri" w:hAnsi="Calibri" w:cs="Calibri"/>
-                <w:sz w:val="20"/>
-                <w:szCs w:val="18"/>
-              </w:rPr>
-              <w:t xml:space="preserve"> }}</w:t>
+              <w:t>{{ panel.cabletype }}</w:t>
             </w:r>
           </w:p>
         </w:tc>
@@ -2821,25 +2583,7 @@
                 <w:sz w:val="20"/>
                 <w:szCs w:val="18"/>
               </w:rPr>
-              <w:t xml:space="preserve">{{ </w:t>
-            </w:r>
-            <w:proofErr w:type="spellStart"/>
-            <w:r>
-              <w:rPr>
-                <w:rFonts w:ascii="Calibri" w:eastAsia="Calibri" w:hAnsi="Calibri" w:cs="Calibri"/>
-                <w:sz w:val="20"/>
-                <w:szCs w:val="18"/>
-              </w:rPr>
-              <w:t>ir.severity</w:t>
-            </w:r>
-            <w:proofErr w:type="spellEnd"/>
-            <w:r>
-              <w:rPr>
-                <w:rFonts w:ascii="Calibri" w:eastAsia="Calibri" w:hAnsi="Calibri" w:cs="Calibri"/>
-                <w:sz w:val="20"/>
-                <w:szCs w:val="18"/>
-              </w:rPr>
-              <w:t xml:space="preserve"> }}</w:t>
+              <w:t>{{ ir.severity }}</w:t>
             </w:r>
           </w:p>
         </w:tc>
@@ -3432,23 +3176,7 @@
                 <w:rFonts w:ascii="Calibri" w:eastAsia="Calibri" w:hAnsi="Calibri" w:cs="Calibri"/>
                 <w:bCs/>
               </w:rPr>
-              <w:t xml:space="preserve">{{ </w:t>
-            </w:r>
-            <w:proofErr w:type="spellStart"/>
-            <w:r>
-              <w:rPr>
-                <w:rFonts w:ascii="Calibri" w:eastAsia="Calibri" w:hAnsi="Calibri" w:cs="Calibri"/>
-                <w:bCs/>
-              </w:rPr>
-              <w:t>tev.prpd</w:t>
-            </w:r>
-            <w:proofErr w:type="spellEnd"/>
-            <w:r>
-              <w:rPr>
-                <w:rFonts w:ascii="Calibri" w:eastAsia="Calibri" w:hAnsi="Calibri" w:cs="Calibri"/>
-                <w:bCs/>
-              </w:rPr>
-              <w:t xml:space="preserve"> }}</w:t>
+              <w:t>{{ tev.prpd }}</w:t>
             </w:r>
           </w:p>
         </w:tc>
@@ -4005,21 +3733,7 @@
               <w:rPr>
                 <w:rFonts w:ascii="Calibri" w:eastAsia="Calibri" w:hAnsi="Calibri" w:cs="Calibri"/>
               </w:rPr>
-              <w:t xml:space="preserve"> {{ </w:t>
-            </w:r>
-            <w:proofErr w:type="spellStart"/>
-            <w:r>
-              <w:rPr>
-                <w:rFonts w:ascii="Calibri" w:eastAsia="Calibri" w:hAnsi="Calibri" w:cs="Calibri"/>
-              </w:rPr>
-              <w:t>us.reading</w:t>
-            </w:r>
-            <w:proofErr w:type="spellEnd"/>
-            <w:r>
-              <w:rPr>
-                <w:rFonts w:ascii="Calibri" w:eastAsia="Calibri" w:hAnsi="Calibri" w:cs="Calibri"/>
-              </w:rPr>
-              <w:t xml:space="preserve"> }}dB</w:t>
+              <w:t xml:space="preserve"> {{ us.reading }}dB</w:t>
             </w:r>
           </w:p>
         </w:tc>
@@ -4255,21 +3969,7 @@
               <w:rPr>
                 <w:rFonts w:ascii="Calibri" w:eastAsia="Calibri" w:hAnsi="Calibri" w:cs="Calibri"/>
               </w:rPr>
-              <w:t xml:space="preserve"> {{ </w:t>
-            </w:r>
-            <w:proofErr w:type="spellStart"/>
-            <w:r>
-              <w:rPr>
-                <w:rFonts w:ascii="Calibri" w:eastAsia="Calibri" w:hAnsi="Calibri" w:cs="Calibri"/>
-              </w:rPr>
-              <w:t>us.char</w:t>
-            </w:r>
-            <w:proofErr w:type="spellEnd"/>
-            <w:r>
-              <w:rPr>
-                <w:rFonts w:ascii="Calibri" w:eastAsia="Calibri" w:hAnsi="Calibri" w:cs="Calibri"/>
-              </w:rPr>
-              <w:t xml:space="preserve"> }}</w:t>
+              <w:t xml:space="preserve"> {{ us.char }}</w:t>
             </w:r>
           </w:p>
         </w:tc>
@@ -4538,21 +4238,7 @@
               <w:rPr>
                 <w:rFonts w:ascii="Calibri" w:eastAsia="Calibri" w:hAnsi="Calibri" w:cs="Calibri"/>
               </w:rPr>
-              <w:t xml:space="preserve"> {{ </w:t>
-            </w:r>
-            <w:proofErr w:type="spellStart"/>
-            <w:r>
-              <w:rPr>
-                <w:rFonts w:ascii="Calibri" w:eastAsia="Calibri" w:hAnsi="Calibri" w:cs="Calibri"/>
-              </w:rPr>
-              <w:t>us.severity</w:t>
-            </w:r>
-            <w:proofErr w:type="spellEnd"/>
-            <w:r>
-              <w:rPr>
-                <w:rFonts w:ascii="Calibri" w:eastAsia="Calibri" w:hAnsi="Calibri" w:cs="Calibri"/>
-              </w:rPr>
-              <w:t xml:space="preserve"> }}</w:t>
+              <w:t xml:space="preserve"> {{ us.severity }}</w:t>
             </w:r>
           </w:p>
         </w:tc>
@@ -4628,25 +4314,7 @@
                 <w:sz w:val="20"/>
                 <w:szCs w:val="20"/>
               </w:rPr>
-              <w:t xml:space="preserve">{{ </w:t>
-            </w:r>
-            <w:proofErr w:type="spellStart"/>
-            <w:r>
-              <w:rPr>
-                <w:rFonts w:ascii="Calibri" w:eastAsia="Calibri" w:hAnsi="Calibri" w:cs="Calibri"/>
-                <w:sz w:val="20"/>
-                <w:szCs w:val="20"/>
-              </w:rPr>
-              <w:t>tev.reading</w:t>
-            </w:r>
-            <w:proofErr w:type="spellEnd"/>
-            <w:r>
-              <w:rPr>
-                <w:rFonts w:ascii="Calibri" w:eastAsia="Calibri" w:hAnsi="Calibri" w:cs="Calibri"/>
-                <w:sz w:val="20"/>
-                <w:szCs w:val="20"/>
-              </w:rPr>
-              <w:t xml:space="preserve"> }}dB</w:t>
+              <w:t>{{ tev.reading }}dB</w:t>
             </w:r>
           </w:p>
         </w:tc>
@@ -4678,25 +4346,7 @@
                 <w:sz w:val="20"/>
                 <w:szCs w:val="20"/>
               </w:rPr>
-              <w:t xml:space="preserve">{{ </w:t>
-            </w:r>
-            <w:proofErr w:type="spellStart"/>
-            <w:r>
-              <w:rPr>
-                <w:rFonts w:ascii="Calibri" w:eastAsia="Calibri" w:hAnsi="Calibri" w:cs="Calibri"/>
-                <w:sz w:val="20"/>
-                <w:szCs w:val="20"/>
-              </w:rPr>
-              <w:t>tev.ppc</w:t>
-            </w:r>
-            <w:proofErr w:type="spellEnd"/>
-            <w:r>
-              <w:rPr>
-                <w:rFonts w:ascii="Calibri" w:eastAsia="Calibri" w:hAnsi="Calibri" w:cs="Calibri"/>
-                <w:sz w:val="20"/>
-                <w:szCs w:val="20"/>
-              </w:rPr>
-              <w:t xml:space="preserve"> }}</w:t>
+              <w:t>{{ tev.ppc }}</w:t>
             </w:r>
           </w:p>
         </w:tc>
@@ -4728,25 +4378,7 @@
                 <w:sz w:val="20"/>
                 <w:szCs w:val="20"/>
               </w:rPr>
-              <w:t xml:space="preserve">{{ </w:t>
-            </w:r>
-            <w:proofErr w:type="spellStart"/>
-            <w:r>
-              <w:rPr>
-                <w:rFonts w:ascii="Calibri" w:eastAsia="Calibri" w:hAnsi="Calibri" w:cs="Calibri"/>
-                <w:sz w:val="20"/>
-                <w:szCs w:val="20"/>
-              </w:rPr>
-              <w:t>tev.severity</w:t>
-            </w:r>
-            <w:proofErr w:type="spellEnd"/>
-            <w:r>
-              <w:rPr>
-                <w:rFonts w:ascii="Calibri" w:eastAsia="Calibri" w:hAnsi="Calibri" w:cs="Calibri"/>
-                <w:sz w:val="20"/>
-                <w:szCs w:val="20"/>
-              </w:rPr>
-              <w:t xml:space="preserve"> }}</w:t>
+              <w:t>{{ tev.severity }}</w:t>
             </w:r>
           </w:p>
         </w:tc>

</xml_diff>

<commit_message>
feat(quick-report): refine cbm defect detail fields
Format anti-condensation heater as ON/OFF for VCB and dash for non-VCB.
Default ultrasound characteristic to NORMAL on SWG/TX detail pages.
Set busbar position to MAIN on VCB and dash on transition/non-VCB.

Closes #5
</commit_message>
<xml_diff>
--- a/templates/QUICK REPORT/DEFECT IR US TEV/swg-panel.docx
+++ b/templates/QUICK REPORT/DEFECT IR US TEV/swg-panel.docx
@@ -161,7 +161,21 @@
               <w:rPr>
                 <w:rFonts w:ascii="Calibri" w:eastAsia="Calibri" w:hAnsi="Calibri" w:cs="Calibri"/>
               </w:rPr>
-              <w:t>{{ substation.name_erms }}</w:t>
+              <w:t xml:space="preserve">{{ </w:t>
+            </w:r>
+            <w:proofErr w:type="spellStart"/>
+            <w:r>
+              <w:rPr>
+                <w:rFonts w:ascii="Calibri" w:eastAsia="Calibri" w:hAnsi="Calibri" w:cs="Calibri"/>
+              </w:rPr>
+              <w:t>substation.name_erms</w:t>
+            </w:r>
+            <w:proofErr w:type="spellEnd"/>
+            <w:r>
+              <w:rPr>
+                <w:rFonts w:ascii="Calibri" w:eastAsia="Calibri" w:hAnsi="Calibri" w:cs="Calibri"/>
+              </w:rPr>
+              <w:t xml:space="preserve"> }}</w:t>
             </w:r>
           </w:p>
         </w:tc>
@@ -183,7 +197,21 @@
               <w:rPr>
                 <w:rFonts w:ascii="Calibri" w:eastAsia="Calibri" w:hAnsi="Calibri" w:cs="Calibri"/>
               </w:rPr>
-              <w:t>Date: {{ substation.date }}</w:t>
+              <w:t xml:space="preserve">Date: {{ </w:t>
+            </w:r>
+            <w:proofErr w:type="spellStart"/>
+            <w:r>
+              <w:rPr>
+                <w:rFonts w:ascii="Calibri" w:eastAsia="Calibri" w:hAnsi="Calibri" w:cs="Calibri"/>
+              </w:rPr>
+              <w:t>substation.date</w:t>
+            </w:r>
+            <w:proofErr w:type="spellEnd"/>
+            <w:r>
+              <w:rPr>
+                <w:rFonts w:ascii="Calibri" w:eastAsia="Calibri" w:hAnsi="Calibri" w:cs="Calibri"/>
+              </w:rPr>
+              <w:t xml:space="preserve"> }}</w:t>
             </w:r>
           </w:p>
         </w:tc>
@@ -249,7 +277,21 @@
               <w:rPr>
                 <w:rFonts w:ascii="Calibri" w:eastAsia="Calibri" w:hAnsi="Calibri" w:cs="Calibri"/>
               </w:rPr>
-              <w:t>{{ swg.type }}</w:t>
+              <w:t xml:space="preserve">{{ </w:t>
+            </w:r>
+            <w:proofErr w:type="spellStart"/>
+            <w:r>
+              <w:rPr>
+                <w:rFonts w:ascii="Calibri" w:eastAsia="Calibri" w:hAnsi="Calibri" w:cs="Calibri"/>
+              </w:rPr>
+              <w:t>swg.type</w:t>
+            </w:r>
+            <w:proofErr w:type="spellEnd"/>
+            <w:r>
+              <w:rPr>
+                <w:rFonts w:ascii="Calibri" w:eastAsia="Calibri" w:hAnsi="Calibri" w:cs="Calibri"/>
+              </w:rPr>
+              <w:t xml:space="preserve"> }}</w:t>
             </w:r>
           </w:p>
         </w:tc>
@@ -291,9 +333,23 @@
             </w:pPr>
             <w:r>
               <w:rPr>
-                <w:rFonts w:ascii="Calibri" w:eastAsia="Calibri" w:hAnsi="Calibri" w:cs="Calibri"/>
-              </w:rPr>
-              <w:t>Equipment</w:t>
+                <w:rFonts w:cstheme="minorHAnsi"/>
+              </w:rPr>
+              <w:t xml:space="preserve">{{ </w:t>
+            </w:r>
+            <w:proofErr w:type="spellStart"/>
+            <w:r>
+              <w:rPr>
+                <w:rFonts w:cstheme="minorHAnsi"/>
+              </w:rPr>
+              <w:t>swg.manufacturer</w:t>
+            </w:r>
+            <w:proofErr w:type="spellEnd"/>
+            <w:r>
+              <w:rPr>
+                <w:rFonts w:cstheme="minorHAnsi"/>
+              </w:rPr>
+              <w:t xml:space="preserve"> }}</w:t>
             </w:r>
           </w:p>
         </w:tc>
@@ -313,9 +369,23 @@
             </w:pPr>
             <w:r>
               <w:rPr>
-                <w:rFonts w:ascii="Calibri" w:eastAsia="Calibri" w:hAnsi="Calibri" w:cs="Calibri"/>
-              </w:rPr>
-              <w:t>{{ swg.type }}</w:t>
+                <w:rFonts w:cstheme="minorHAnsi"/>
+              </w:rPr>
+              <w:t xml:space="preserve">Time: {{ </w:t>
+            </w:r>
+            <w:proofErr w:type="spellStart"/>
+            <w:r>
+              <w:rPr>
+                <w:rFonts w:cstheme="minorHAnsi"/>
+              </w:rPr>
+              <w:t>substation.time</w:t>
+            </w:r>
+            <w:proofErr w:type="spellEnd"/>
+            <w:r>
+              <w:rPr>
+                <w:rFonts w:cstheme="minorHAnsi"/>
+              </w:rPr>
+              <w:t xml:space="preserve"> }}</w:t>
             </w:r>
           </w:p>
         </w:tc>
@@ -379,7 +449,21 @@
               <w:rPr>
                 <w:rFonts w:ascii="Calibri" w:eastAsia="Calibri" w:hAnsi="Calibri" w:cs="Calibri"/>
               </w:rPr>
-              <w:t>{{ swg.model }}</w:t>
+              <w:t xml:space="preserve">{{ </w:t>
+            </w:r>
+            <w:proofErr w:type="spellStart"/>
+            <w:r>
+              <w:rPr>
+                <w:rFonts w:ascii="Calibri" w:eastAsia="Calibri" w:hAnsi="Calibri" w:cs="Calibri"/>
+              </w:rPr>
+              <w:t>swg.model</w:t>
+            </w:r>
+            <w:proofErr w:type="spellEnd"/>
+            <w:r>
+              <w:rPr>
+                <w:rFonts w:ascii="Calibri" w:eastAsia="Calibri" w:hAnsi="Calibri" w:cs="Calibri"/>
+              </w:rPr>
+              <w:t xml:space="preserve"> }}</w:t>
             </w:r>
           </w:p>
         </w:tc>
@@ -421,9 +505,26 @@
             </w:pPr>
             <w:r>
               <w:rPr>
-                <w:rFonts w:ascii="Calibri" w:eastAsia="Calibri" w:hAnsi="Calibri" w:cs="Calibri"/>
-              </w:rPr>
-              <w:t>Model</w:t>
+                <w:rFonts w:cstheme="minorHAnsi"/>
+                <w:color w:val="000000"/>
+              </w:rPr>
+              <w:t xml:space="preserve">{{ </w:t>
+            </w:r>
+            <w:proofErr w:type="spellStart"/>
+            <w:r>
+              <w:rPr>
+                <w:rFonts w:cstheme="minorHAnsi"/>
+                <w:color w:val="000000"/>
+              </w:rPr>
+              <w:t>swg.rating</w:t>
+            </w:r>
+            <w:proofErr w:type="spellEnd"/>
+            <w:r>
+              <w:rPr>
+                <w:rFonts w:cstheme="minorHAnsi"/>
+                <w:color w:val="000000"/>
+              </w:rPr>
+              <w:t xml:space="preserve"> }}</w:t>
             </w:r>
           </w:p>
         </w:tc>
@@ -443,9 +544,23 @@
             </w:pPr>
             <w:r>
               <w:rPr>
-                <w:rFonts w:ascii="Calibri" w:eastAsia="Calibri" w:hAnsi="Calibri" w:cs="Calibri"/>
-              </w:rPr>
-              <w:t>{{ swg.model }}</w:t>
+                <w:rFonts w:cstheme="minorHAnsi"/>
+              </w:rPr>
+              <w:t xml:space="preserve">Humidity: {{ </w:t>
+            </w:r>
+            <w:proofErr w:type="spellStart"/>
+            <w:r>
+              <w:rPr>
+                <w:rFonts w:cstheme="minorHAnsi"/>
+              </w:rPr>
+              <w:t>substation.humidity</w:t>
+            </w:r>
+            <w:proofErr w:type="spellEnd"/>
+            <w:r>
+              <w:rPr>
+                <w:rFonts w:cstheme="minorHAnsi"/>
+              </w:rPr>
+              <w:t xml:space="preserve"> }}</w:t>
             </w:r>
           </w:p>
         </w:tc>
@@ -509,7 +624,21 @@
               <w:rPr>
                 <w:rFonts w:ascii="Calibri" w:eastAsia="Calibri" w:hAnsi="Calibri" w:cs="Calibri"/>
               </w:rPr>
-              <w:t>{{ panel.area }}</w:t>
+              <w:t xml:space="preserve">{{ </w:t>
+            </w:r>
+            <w:proofErr w:type="spellStart"/>
+            <w:r>
+              <w:rPr>
+                <w:rFonts w:ascii="Calibri" w:eastAsia="Calibri" w:hAnsi="Calibri" w:cs="Calibri"/>
+              </w:rPr>
+              <w:t>panel.area</w:t>
+            </w:r>
+            <w:proofErr w:type="spellEnd"/>
+            <w:r>
+              <w:rPr>
+                <w:rFonts w:ascii="Calibri" w:eastAsia="Calibri" w:hAnsi="Calibri" w:cs="Calibri"/>
+              </w:rPr>
+              <w:t xml:space="preserve"> }}</w:t>
             </w:r>
           </w:p>
         </w:tc>
@@ -553,7 +682,21 @@
               <w:rPr>
                 <w:rFonts w:cstheme="minorHAnsi"/>
               </w:rPr>
-              <w:t>{{ panel.linknumber }}</w:t>
+              <w:t xml:space="preserve">{{ </w:t>
+            </w:r>
+            <w:proofErr w:type="spellStart"/>
+            <w:r>
+              <w:rPr>
+                <w:rFonts w:cstheme="minorHAnsi"/>
+              </w:rPr>
+              <w:t>panel.linknumber</w:t>
+            </w:r>
+            <w:proofErr w:type="spellEnd"/>
+            <w:r>
+              <w:rPr>
+                <w:rFonts w:cstheme="minorHAnsi"/>
+              </w:rPr>
+              <w:t xml:space="preserve"> }}</w:t>
             </w:r>
           </w:p>
         </w:tc>
@@ -982,7 +1125,7 @@
                   <v:path o:extrusionok="f" gradientshapeok="t" o:connecttype="rect"/>
                   <o:lock v:ext="edit" aspectratio="t"/>
                 </v:shapetype>
-                <v:shape id="_x0000_i1027" type="#_x0000_t75" style="width:237.85pt;height:147.85pt" o:ole="">
+                <v:shape id="_x0000_i1027" type="#_x0000_t75" style="width:237.55pt;height:147.95pt" o:ole="">
                   <v:imagedata r:id="rId7" o:title="" croptop="1206f" cropbottom="3617f" cropleft="781f" cropright="781f"/>
                 </v:shape>
                 <w:control r:id="rId8" w:name="CIRViewer1211111131211" w:shapeid="_x0000_i1027"/>
@@ -1124,7 +1267,21 @@
               <w:rPr>
                 <w:rFonts w:ascii="Calibri" w:eastAsia="Calibri" w:hAnsi="Calibri" w:cs="Calibri"/>
               </w:rPr>
-              <w:t>{{ visual.image }}</w:t>
+              <w:t xml:space="preserve">{{ </w:t>
+            </w:r>
+            <w:proofErr w:type="spellStart"/>
+            <w:r>
+              <w:rPr>
+                <w:rFonts w:ascii="Calibri" w:eastAsia="Calibri" w:hAnsi="Calibri" w:cs="Calibri"/>
+              </w:rPr>
+              <w:t>visual.image</w:t>
+            </w:r>
+            <w:proofErr w:type="spellEnd"/>
+            <w:r>
+              <w:rPr>
+                <w:rFonts w:ascii="Calibri" w:eastAsia="Calibri" w:hAnsi="Calibri" w:cs="Calibri"/>
+              </w:rPr>
+              <w:t xml:space="preserve"> }}</w:t>
             </w:r>
           </w:p>
         </w:tc>
@@ -1451,7 +1608,7 @@
                 <w:sz w:val="20"/>
                 <w:szCs w:val="18"/>
               </w:rPr>
-              <w:instrText xml:space="preserve">DOCVARIABLE _Fd663856097 \* MERGEFORMAT </w:instrText>
+              <w:instrText xml:space="preserve">DOCVARIABLE _Fd1058109235 \* MERGEFORMAT </w:instrText>
             </w:r>
             <w:r>
               <w:rPr>
@@ -1644,7 +1801,7 @@
                 <w:sz w:val="20"/>
                 <w:szCs w:val="18"/>
               </w:rPr>
-              <w:instrText xml:space="preserve">DOCVARIABLE _Fd1359591791 \* MERGEFORMAT </w:instrText>
+              <w:instrText xml:space="preserve">DOCVARIABLE _Fd353656613 \* MERGEFORMAT </w:instrText>
             </w:r>
             <w:r>
               <w:rPr>
@@ -1741,7 +1898,25 @@
                 <w:sz w:val="20"/>
                 <w:szCs w:val="18"/>
               </w:rPr>
-              <w:t>{{ panel.serialnumber }}</w:t>
+              <w:t xml:space="preserve">{{ </w:t>
+            </w:r>
+            <w:proofErr w:type="spellStart"/>
+            <w:r>
+              <w:rPr>
+                <w:rFonts w:ascii="Calibri" w:eastAsia="Calibri" w:hAnsi="Calibri" w:cs="Calibri"/>
+                <w:sz w:val="20"/>
+                <w:szCs w:val="18"/>
+              </w:rPr>
+              <w:t>panel.serialnumber</w:t>
+            </w:r>
+            <w:proofErr w:type="spellEnd"/>
+            <w:r>
+              <w:rPr>
+                <w:rFonts w:ascii="Calibri" w:eastAsia="Calibri" w:hAnsi="Calibri" w:cs="Calibri"/>
+                <w:sz w:val="20"/>
+                <w:szCs w:val="18"/>
+              </w:rPr>
+              <w:t xml:space="preserve"> }}</w:t>
             </w:r>
           </w:p>
         </w:tc>
@@ -1841,7 +2016,7 @@
                 <w:sz w:val="20"/>
                 <w:szCs w:val="18"/>
               </w:rPr>
-              <w:instrText xml:space="preserve">DOCVARIABLE _Fd1903727906 \* MERGEFORMAT </w:instrText>
+              <w:instrText xml:space="preserve">DOCVARIABLE _Fd159943612 \* MERGEFORMAT </w:instrText>
             </w:r>
             <w:r>
               <w:rPr>
@@ -1945,7 +2120,25 @@
                 <w:sz w:val="20"/>
                 <w:szCs w:val="18"/>
               </w:rPr>
-              <w:t>{{ panel.heateramp }}</w:t>
+              <w:t xml:space="preserve">{{ </w:t>
+            </w:r>
+            <w:proofErr w:type="spellStart"/>
+            <w:r>
+              <w:rPr>
+                <w:rFonts w:ascii="Calibri" w:eastAsia="Calibri" w:hAnsi="Calibri" w:cs="Calibri"/>
+                <w:sz w:val="20"/>
+                <w:szCs w:val="18"/>
+              </w:rPr>
+              <w:t>panel.heateramp</w:t>
+            </w:r>
+            <w:proofErr w:type="spellEnd"/>
+            <w:r>
+              <w:rPr>
+                <w:rFonts w:ascii="Calibri" w:eastAsia="Calibri" w:hAnsi="Calibri" w:cs="Calibri"/>
+                <w:sz w:val="20"/>
+                <w:szCs w:val="18"/>
+              </w:rPr>
+              <w:t xml:space="preserve"> }}</w:t>
             </w:r>
           </w:p>
         </w:tc>
@@ -2037,7 +2230,25 @@
                 <w:sz w:val="20"/>
                 <w:szCs w:val="20"/>
               </w:rPr>
-              <w:t>{{ substation.ambient }}</w:t>
+              <w:t xml:space="preserve">{{ </w:t>
+            </w:r>
+            <w:proofErr w:type="spellStart"/>
+            <w:r>
+              <w:rPr>
+                <w:rFonts w:ascii="Calibri" w:eastAsia="Calibri" w:hAnsi="Calibri" w:cs="Calibri"/>
+                <w:sz w:val="20"/>
+                <w:szCs w:val="20"/>
+              </w:rPr>
+              <w:t>substation.ambient</w:t>
+            </w:r>
+            <w:proofErr w:type="spellEnd"/>
+            <w:r>
+              <w:rPr>
+                <w:rFonts w:ascii="Calibri" w:eastAsia="Calibri" w:hAnsi="Calibri" w:cs="Calibri"/>
+                <w:sz w:val="20"/>
+                <w:szCs w:val="20"/>
+              </w:rPr>
+              <w:t xml:space="preserve"> }}</w:t>
             </w:r>
           </w:p>
         </w:tc>
@@ -2110,7 +2321,25 @@
                 <w:sz w:val="20"/>
                 <w:szCs w:val="18"/>
               </w:rPr>
-              <w:t>{{ panel.breakerstatus }}</w:t>
+              <w:t xml:space="preserve">{{ </w:t>
+            </w:r>
+            <w:proofErr w:type="spellStart"/>
+            <w:r>
+              <w:rPr>
+                <w:rFonts w:ascii="Calibri" w:eastAsia="Calibri" w:hAnsi="Calibri" w:cs="Calibri"/>
+                <w:sz w:val="20"/>
+                <w:szCs w:val="18"/>
+              </w:rPr>
+              <w:t>panel.breakerstatus</w:t>
+            </w:r>
+            <w:proofErr w:type="spellEnd"/>
+            <w:r>
+              <w:rPr>
+                <w:rFonts w:ascii="Calibri" w:eastAsia="Calibri" w:hAnsi="Calibri" w:cs="Calibri"/>
+                <w:sz w:val="20"/>
+                <w:szCs w:val="18"/>
+              </w:rPr>
+              <w:t xml:space="preserve"> }}</w:t>
             </w:r>
           </w:p>
         </w:tc>
@@ -2211,7 +2440,7 @@
                 <w:sz w:val="20"/>
                 <w:szCs w:val="20"/>
               </w:rPr>
-              <w:instrText xml:space="preserve">DOCVARIABLE _Fd908560405 \* MERGEFORMAT </w:instrText>
+              <w:instrText xml:space="preserve">DOCVARIABLE _Fd322579019 \* MERGEFORMAT </w:instrText>
             </w:r>
             <w:r>
               <w:rPr>
@@ -2314,7 +2543,25 @@
                 <w:sz w:val="20"/>
                 <w:szCs w:val="18"/>
               </w:rPr>
-              <w:t>{{ panel.busbarposition }}</w:t>
+              <w:t xml:space="preserve">{{ </w:t>
+            </w:r>
+            <w:proofErr w:type="spellStart"/>
+            <w:r>
+              <w:rPr>
+                <w:rFonts w:ascii="Calibri" w:eastAsia="Calibri" w:hAnsi="Calibri" w:cs="Calibri"/>
+                <w:sz w:val="20"/>
+                <w:szCs w:val="18"/>
+              </w:rPr>
+              <w:t>panel.busbarposition</w:t>
+            </w:r>
+            <w:proofErr w:type="spellEnd"/>
+            <w:r>
+              <w:rPr>
+                <w:rFonts w:ascii="Calibri" w:eastAsia="Calibri" w:hAnsi="Calibri" w:cs="Calibri"/>
+                <w:sz w:val="20"/>
+                <w:szCs w:val="18"/>
+              </w:rPr>
+              <w:t xml:space="preserve"> }}</w:t>
             </w:r>
           </w:p>
         </w:tc>
@@ -2406,7 +2653,25 @@
                 <w:sz w:val="20"/>
                 <w:szCs w:val="18"/>
               </w:rPr>
-              <w:t>{{ panel.loadamp }}</w:t>
+              <w:t xml:space="preserve">{{ </w:t>
+            </w:r>
+            <w:proofErr w:type="spellStart"/>
+            <w:r>
+              <w:rPr>
+                <w:rFonts w:ascii="Calibri" w:eastAsia="Calibri" w:hAnsi="Calibri" w:cs="Calibri"/>
+                <w:sz w:val="20"/>
+                <w:szCs w:val="18"/>
+              </w:rPr>
+              <w:t>panel.loadamp</w:t>
+            </w:r>
+            <w:proofErr w:type="spellEnd"/>
+            <w:r>
+              <w:rPr>
+                <w:rFonts w:ascii="Calibri" w:eastAsia="Calibri" w:hAnsi="Calibri" w:cs="Calibri"/>
+                <w:sz w:val="20"/>
+                <w:szCs w:val="18"/>
+              </w:rPr>
+              <w:t xml:space="preserve"> }}</w:t>
             </w:r>
           </w:p>
         </w:tc>
@@ -2485,7 +2750,25 @@
                 <w:sz w:val="20"/>
                 <w:szCs w:val="18"/>
               </w:rPr>
-              <w:t>{{ panel.cabletype }}</w:t>
+              <w:t xml:space="preserve">{{ </w:t>
+            </w:r>
+            <w:proofErr w:type="spellStart"/>
+            <w:r>
+              <w:rPr>
+                <w:rFonts w:ascii="Calibri" w:eastAsia="Calibri" w:hAnsi="Calibri" w:cs="Calibri"/>
+                <w:sz w:val="20"/>
+                <w:szCs w:val="18"/>
+              </w:rPr>
+              <w:t>panel.cabletype</w:t>
+            </w:r>
+            <w:proofErr w:type="spellEnd"/>
+            <w:r>
+              <w:rPr>
+                <w:rFonts w:ascii="Calibri" w:eastAsia="Calibri" w:hAnsi="Calibri" w:cs="Calibri"/>
+                <w:sz w:val="20"/>
+                <w:szCs w:val="18"/>
+              </w:rPr>
+              <w:t xml:space="preserve"> }}</w:t>
             </w:r>
           </w:p>
         </w:tc>
@@ -2583,7 +2866,25 @@
                 <w:sz w:val="20"/>
                 <w:szCs w:val="18"/>
               </w:rPr>
-              <w:t>{{ ir.severity }}</w:t>
+              <w:t xml:space="preserve">{{ </w:t>
+            </w:r>
+            <w:proofErr w:type="spellStart"/>
+            <w:r>
+              <w:rPr>
+                <w:rFonts w:ascii="Calibri" w:eastAsia="Calibri" w:hAnsi="Calibri" w:cs="Calibri"/>
+                <w:sz w:val="20"/>
+                <w:szCs w:val="18"/>
+              </w:rPr>
+              <w:t>ir.severity</w:t>
+            </w:r>
+            <w:proofErr w:type="spellEnd"/>
+            <w:r>
+              <w:rPr>
+                <w:rFonts w:ascii="Calibri" w:eastAsia="Calibri" w:hAnsi="Calibri" w:cs="Calibri"/>
+                <w:sz w:val="20"/>
+                <w:szCs w:val="18"/>
+              </w:rPr>
+              <w:t xml:space="preserve"> }}</w:t>
             </w:r>
           </w:p>
         </w:tc>
@@ -3176,7 +3477,23 @@
                 <w:rFonts w:ascii="Calibri" w:eastAsia="Calibri" w:hAnsi="Calibri" w:cs="Calibri"/>
                 <w:bCs/>
               </w:rPr>
-              <w:t>{{ tev.prpd }}</w:t>
+              <w:t xml:space="preserve">{{ </w:t>
+            </w:r>
+            <w:proofErr w:type="spellStart"/>
+            <w:r>
+              <w:rPr>
+                <w:rFonts w:ascii="Calibri" w:eastAsia="Calibri" w:hAnsi="Calibri" w:cs="Calibri"/>
+                <w:bCs/>
+              </w:rPr>
+              <w:t>tev.prpd</w:t>
+            </w:r>
+            <w:proofErr w:type="spellEnd"/>
+            <w:r>
+              <w:rPr>
+                <w:rFonts w:ascii="Calibri" w:eastAsia="Calibri" w:hAnsi="Calibri" w:cs="Calibri"/>
+                <w:bCs/>
+              </w:rPr>
+              <w:t xml:space="preserve"> }}</w:t>
             </w:r>
           </w:p>
         </w:tc>
@@ -3733,7 +4050,21 @@
               <w:rPr>
                 <w:rFonts w:ascii="Calibri" w:eastAsia="Calibri" w:hAnsi="Calibri" w:cs="Calibri"/>
               </w:rPr>
-              <w:t xml:space="preserve"> {{ us.reading }}dB</w:t>
+              <w:t xml:space="preserve"> {{ </w:t>
+            </w:r>
+            <w:proofErr w:type="spellStart"/>
+            <w:r>
+              <w:rPr>
+                <w:rFonts w:ascii="Calibri" w:eastAsia="Calibri" w:hAnsi="Calibri" w:cs="Calibri"/>
+              </w:rPr>
+              <w:t>us.reading</w:t>
+            </w:r>
+            <w:proofErr w:type="spellEnd"/>
+            <w:r>
+              <w:rPr>
+                <w:rFonts w:ascii="Calibri" w:eastAsia="Calibri" w:hAnsi="Calibri" w:cs="Calibri"/>
+              </w:rPr>
+              <w:t xml:space="preserve"> }}dB</w:t>
             </w:r>
           </w:p>
         </w:tc>
@@ -3969,7 +4300,21 @@
               <w:rPr>
                 <w:rFonts w:ascii="Calibri" w:eastAsia="Calibri" w:hAnsi="Calibri" w:cs="Calibri"/>
               </w:rPr>
-              <w:t xml:space="preserve"> {{ us.char }}</w:t>
+              <w:t xml:space="preserve"> {{ </w:t>
+            </w:r>
+            <w:proofErr w:type="spellStart"/>
+            <w:r>
+              <w:rPr>
+                <w:rFonts w:ascii="Calibri" w:eastAsia="Calibri" w:hAnsi="Calibri" w:cs="Calibri"/>
+              </w:rPr>
+              <w:t>us.char</w:t>
+            </w:r>
+            <w:proofErr w:type="spellEnd"/>
+            <w:r>
+              <w:rPr>
+                <w:rFonts w:ascii="Calibri" w:eastAsia="Calibri" w:hAnsi="Calibri" w:cs="Calibri"/>
+              </w:rPr>
+              <w:t xml:space="preserve"> }}</w:t>
             </w:r>
           </w:p>
         </w:tc>
@@ -4238,7 +4583,21 @@
               <w:rPr>
                 <w:rFonts w:ascii="Calibri" w:eastAsia="Calibri" w:hAnsi="Calibri" w:cs="Calibri"/>
               </w:rPr>
-              <w:t xml:space="preserve"> {{ us.severity }}</w:t>
+              <w:t xml:space="preserve"> {{ </w:t>
+            </w:r>
+            <w:proofErr w:type="spellStart"/>
+            <w:r>
+              <w:rPr>
+                <w:rFonts w:ascii="Calibri" w:eastAsia="Calibri" w:hAnsi="Calibri" w:cs="Calibri"/>
+              </w:rPr>
+              <w:t>us.severity</w:t>
+            </w:r>
+            <w:proofErr w:type="spellEnd"/>
+            <w:r>
+              <w:rPr>
+                <w:rFonts w:ascii="Calibri" w:eastAsia="Calibri" w:hAnsi="Calibri" w:cs="Calibri"/>
+              </w:rPr>
+              <w:t xml:space="preserve"> }}</w:t>
             </w:r>
           </w:p>
         </w:tc>
@@ -4314,7 +4673,25 @@
                 <w:sz w:val="20"/>
                 <w:szCs w:val="20"/>
               </w:rPr>
-              <w:t>{{ tev.reading }}dB</w:t>
+              <w:t xml:space="preserve">{{ </w:t>
+            </w:r>
+            <w:proofErr w:type="spellStart"/>
+            <w:r>
+              <w:rPr>
+                <w:rFonts w:ascii="Calibri" w:eastAsia="Calibri" w:hAnsi="Calibri" w:cs="Calibri"/>
+                <w:sz w:val="20"/>
+                <w:szCs w:val="20"/>
+              </w:rPr>
+              <w:t>tev.reading</w:t>
+            </w:r>
+            <w:proofErr w:type="spellEnd"/>
+            <w:r>
+              <w:rPr>
+                <w:rFonts w:ascii="Calibri" w:eastAsia="Calibri" w:hAnsi="Calibri" w:cs="Calibri"/>
+                <w:sz w:val="20"/>
+                <w:szCs w:val="20"/>
+              </w:rPr>
+              <w:t xml:space="preserve"> }}dB</w:t>
             </w:r>
           </w:p>
         </w:tc>
@@ -4346,7 +4723,25 @@
                 <w:sz w:val="20"/>
                 <w:szCs w:val="20"/>
               </w:rPr>
-              <w:t>{{ tev.ppc }}</w:t>
+              <w:t xml:space="preserve">{{ </w:t>
+            </w:r>
+            <w:proofErr w:type="spellStart"/>
+            <w:r>
+              <w:rPr>
+                <w:rFonts w:ascii="Calibri" w:eastAsia="Calibri" w:hAnsi="Calibri" w:cs="Calibri"/>
+                <w:sz w:val="20"/>
+                <w:szCs w:val="20"/>
+              </w:rPr>
+              <w:t>tev.ppc</w:t>
+            </w:r>
+            <w:proofErr w:type="spellEnd"/>
+            <w:r>
+              <w:rPr>
+                <w:rFonts w:ascii="Calibri" w:eastAsia="Calibri" w:hAnsi="Calibri" w:cs="Calibri"/>
+                <w:sz w:val="20"/>
+                <w:szCs w:val="20"/>
+              </w:rPr>
+              <w:t xml:space="preserve"> }}</w:t>
             </w:r>
           </w:p>
         </w:tc>
@@ -4378,7 +4773,25 @@
                 <w:sz w:val="20"/>
                 <w:szCs w:val="20"/>
               </w:rPr>
-              <w:t>{{ tev.severity }}</w:t>
+              <w:t xml:space="preserve">{{ </w:t>
+            </w:r>
+            <w:proofErr w:type="spellStart"/>
+            <w:r>
+              <w:rPr>
+                <w:rFonts w:ascii="Calibri" w:eastAsia="Calibri" w:hAnsi="Calibri" w:cs="Calibri"/>
+                <w:sz w:val="20"/>
+                <w:szCs w:val="20"/>
+              </w:rPr>
+              <w:t>tev.severity</w:t>
+            </w:r>
+            <w:proofErr w:type="spellEnd"/>
+            <w:r>
+              <w:rPr>
+                <w:rFonts w:ascii="Calibri" w:eastAsia="Calibri" w:hAnsi="Calibri" w:cs="Calibri"/>
+                <w:sz w:val="20"/>
+                <w:szCs w:val="20"/>
+              </w:rPr>
+              <w:t xml:space="preserve"> }}</w:t>
             </w:r>
           </w:p>
         </w:tc>
@@ -5062,6 +5475,7 @@
               <w:rPr>
                 <w:rFonts w:ascii="Calibri" w:eastAsia="Calibri" w:hAnsi="Calibri" w:cs="Calibri"/>
               </w:rPr>
+              <w:lastRenderedPageBreak/>
               <w:t>Analysis &amp; Recommendations:</w:t>
             </w:r>
           </w:p>
@@ -5148,7 +5562,6 @@
                 <w:noProof/>
                 <w:lang w:val="en-US"/>
               </w:rPr>
-              <w:lastRenderedPageBreak/>
               <w:t xml:space="preserve">Recommendation: </w:t>
             </w:r>
             <w:r>

</xml_diff>